<commit_message>
docs: role-neutral wording in the AD access report guides
- Replace "Service desk", "Engineer / Level 2" and "escalate to Level 2" with
  "You" and "your AD admin" (whoever looks after Active Directory), defined
  once in the guide - job titles and support tiers differ between companies
- Rename the full guide to "AD Access Report - User Guide.docx"
- Quick guide: "Hand it to whoever looks after Active Directory if..."

Co-Authored-By: Claude Opus 5.5 <noreply@anthropic.com>
</commit_message>
<xml_diff>
--- a/AD-GroupMembership-Export/AD Access Report - Quick Guide.docx
+++ b/AD-GroupMembership-Export/AD Access Report - Quick Guide.docx
@@ -807,7 +807,7 @@
           <w:sz w:val="26"/>
           <w:szCs w:val="26"/>
         </w:rPr>
-        <w:t xml:space="preserve">Escalate to Level 2 if…</w:t>
+        <w:t xml:space="preserve">Hand it to whoever looks after Active Directory if…</w:t>
       </w:r>
     </w:p>
     <w:p>
@@ -922,7 +922,7 @@
           <w:sz w:val="19"/>
           <w:szCs w:val="19"/>
         </w:rPr>
-        <w:t xml:space="preserve">Full guide with screenshots: AD Access Report - Service Desk Guide.docx, in the same folder.</w:t>
+        <w:t xml:space="preserve">Full guide with screenshots: AD Access Report - User Guide.docx, in the same folder.</w:t>
       </w:r>
     </w:p>
     <w:sectPr>

</xml_diff>